<commit_message>
T3/T4: thiết kế lại đề cương HuP_4 và báo cáo HuP_3 (chữ đỏ, chờ GVHD xác nhận); cập nhật validate_content theo thiết kế mới
</commit_message>
<xml_diff>
--- a/Đọc_báo_cùng_HuP_3_.docx
+++ b/Đọc_báo_cùng_HuP_3_.docx
@@ -578,8 +578,9 @@
           <w:sz w:val="26"/>
           <w:szCs w:val="26"/>
           <w:rtl w:val="0"/>
+          <w:color w:val="C00000"/>
         </w:rPr>
-        <w:t xml:space="preserve">Thời gian thực hiện bắt đầu từ 15/09/2026. Mốc chốt minh chứng: 30/09/2026. Báo cáo tách ba trạng thái: đã có minh chứng trong kỳ; có trong bản thảo nhưng chưa xác nhận thời điểm; chuyển sang cập nhật/thực hiện tháng 10. Hồ sơ hiện tại chưa đủ căn cứ xác nhận ngày hoàn thành của từng đầu việc tháng 9; không suy ra kết quả thực nghiệm từ kế hoạch.</w:t>
+        <w:t xml:space="preserve">Thời gian thực hiện bắt đầu từ 15/09/2026. Mốc chốt minh chứng: 30/09/2026. Mục 2–4 chỉ ghi “hoàn thành trong kỳ” khi có bản lưu hoặc nhật ký đến 30/09; việc làm sau 30/09 được ghi rõ là “sau kỳ”. Ngày nộp báo cáo: [SINH VIÊN ĐIỀN].</w:t>
       </w:r>
     </w:p>
     <w:p>
@@ -2094,8 +2095,9 @@
                 <w:sz w:val="26"/>
                 <w:szCs w:val="26"/>
                 <w:rtl w:val="0"/>
-              </w:rPr>
-              <w:t xml:space="preserve">Đã đối chiếu báo/[2].pdf: Bảng 1, trang PDF 3 (18087), Pearson/Spearman tiêu chí sufficiency = 0,14/0,09; Bảng 6, trang PDF 10 (18094), Krippendorff’s alpha = 0,0486. Đây là độ khớp bộ chấm với người, không phải đồng thuận hai người hoặc Accuracy kiểm chứng. Mục 3.1, trang PDF 4: 733 claim gốc từ CoverBench, không phải số sub-claim.</w:t>
+                <w:color w:val="C00000"/>
+              </w:rPr>
+              <w:t xml:space="preserve">Theo báo/[2].pdf: Bảng 1, trang PDF 3 (18087), Pearson/Spearman tiêu chí sufficiency = 0,14/0,09; Bảng 6, trang PDF 10 (18094), Krippendorff’s alpha = 0,0486. Đây là độ khớp bộ chấm với người, không phải đồng thuận hai người hoặc Accuracy kiểm chứng. Mục 3.1, trang PDF 4: 733 claim gốc từ CoverBench, không phải số sub-claim. (Số liệu được trích với AI hỗ trợ; sinh viên tự kiểm trên PDF gốc: [SINH VIÊN ĐIỀN: ngày, kết quả].)</w:t>
             </w:r>
           </w:p>
         </w:tc>
@@ -2620,8 +2622,9 @@
                 <w:sz w:val="26"/>
                 <w:szCs w:val="26"/>
                 <w:rtl w:val="0"/>
-              </w:rPr>
-              <w:t xml:space="preserve">Đã đối chiếu báo/[3].pdf: Bảng 1, trang PDF 7, Llama-3.1-8B/QuanTemp, Macro-F1 Adaptive BoN 53,91 so với Top-1 44,80: chênh 9,11 điểm phần trăm. Không dùng “18,8%” ở abstract làm kết quả của cặp số này. Mục 4, trang PDF 6 xác nhận verifier là Llama-3.2-3B fine-tune LoRA, khác mô hình sinh. Đây là kết quả tác giả, chưa tái lập trong KLTN.</w:t>
+                <w:color w:val="C00000"/>
+              </w:rPr>
+              <w:t xml:space="preserve">Theo báo/[3].pdf: Bảng 1, trang PDF 7, Llama-3.1-8B/QuanTemp, Macro-F1 Adaptive BoN 53,91 so với Top-1 44,80: chênh 9,11 điểm phần trăm. Không dùng “18,8%” ở abstract làm kết quả của cặp số này. Mục 4, trang PDF 6 xác nhận verifier là Llama-3.2-3B fine-tune LoRA, khác mô hình sinh. Đây là kết quả tác giả, chưa tái lập trong KLTN. (Số liệu được trích với AI hỗ trợ; sinh viên tự kiểm trên PDF gốc: [SINH VIÊN ĐIỀN: ngày, kết quả].)</w:t>
             </w:r>
           </w:p>
         </w:tc>
@@ -3146,8 +3149,9 @@
                 <w:sz w:val="26"/>
                 <w:szCs w:val="26"/>
                 <w:rtl w:val="0"/>
-              </w:rPr>
-              <w:t xml:space="preserve">Đã đối chiếu báo/[4].pdf: Bảng 1, trang PDF 7, Qwen2.5-14B/DRUID, CLUE-Span+Steering có Entropy-CCT 0,102; PromptBaseline −0,080. Đây là tương quan, không phải Accuracy/F1. Mục 5.1, trang PDF 6 và Phụ lục I.1, trang PDF 21: 12 người đánh giá 120 lời giải thích của 40 claim (20 DRUID, 20 HealthVer).</w:t>
+                <w:color w:val="C00000"/>
+              </w:rPr>
+              <w:t xml:space="preserve">Theo báo/[4].pdf: Bảng 1, trang PDF 7, Qwen2.5-14B/DRUID, CLUE-Span+Steering có Entropy-CCT 0,102; PromptBaseline −0,080. Đây là tương quan, không phải Accuracy/F1. Mục 5.1, trang PDF 6 và Phụ lục I.1, trang PDF 21: 12 người đánh giá 120 lời giải thích của 40 claim (20 DRUID, 20 HealthVer). (Số liệu được trích với AI hỗ trợ; sinh viên tự kiểm trên PDF gốc: [SINH VIÊN ĐIỀN: ngày, kết quả].)</w:t>
             </w:r>
           </w:p>
         </w:tc>
@@ -3672,8 +3676,9 @@
                 <w:sz w:val="26"/>
                 <w:szCs w:val="26"/>
                 <w:rtl w:val="0"/>
-              </w:rPr>
-              <w:t xml:space="preserve">Đã đối chiếu báo/[5].pdf: Bảng 2, trang PDF 9, ContraNote Conflict: CoVer Accuracy 86,0%, Macro-F1 68,0%; Confact Macro-F1 73,4%. Mục 6.4, trang PDF 8: tác giả báo so sánh CoVer với CONFACT/ConflictRes trên Conflict không có ý nghĩa theo McNemar, α=0,05. Không suy rộng nhận xét này sang mọi tập/chỉ số; KLTN không tự chạy lại kiểm định.</w:t>
+                <w:color w:val="C00000"/>
+              </w:rPr>
+              <w:t xml:space="preserve">Theo báo/[5].pdf: Bảng 2, trang PDF 9, ContraNote Conflict: CoVer Accuracy 86,0%, Macro-F1 68,0%; Confact Macro-F1 73,4%. Mục 6.4, trang PDF 8: tác giả báo so sánh CoVer với CONFACT/ConflictRes trên Conflict không có ý nghĩa theo McNemar, α=0,05. Không suy rộng nhận xét này sang mọi tập/chỉ số; KLTN không tự chạy lại kiểm định. (Số liệu được trích với AI hỗ trợ; sinh viên tự kiểm trên PDF gốc: [SINH VIÊN ĐIỀN: ngày, kết quả].)</w:t>
             </w:r>
           </w:p>
         </w:tc>
@@ -4397,8 +4402,9 @@
           <w:sz w:val="26"/>
           <w:szCs w:val="26"/>
           <w:rtl w:val="0"/>
+          <w:color w:val="C00000"/>
         </w:rPr>
-        <w:t xml:space="preserve">Đề xuất đọc thêm — bổ sung trong bản rà soát tháng 10: FEVER [7] về ba nhãn và bộ bằng chứng; AVeriTeC [8] về nguồn web và rò rỉ thời gian; ViFactCheck [9] về kiểm chứng tin tiếng Việt; ViWikiFC [10] về truy hồi và dự đoán nhãn từ Wikipedia tiếng Việt; ViNumFCR [11] về kiểm chứng số liệu tiếng Việt. Đây là tài liệu bổ sung cho thiết kế nghiên cứu, không phải xác nhận đã đọc trong tháng 9.</w:t>
+        <w:t xml:space="preserve">Đọc thêm (sau kỳ): FEVER [7] về ba nhãn và bộ bằng chứng; AVeriTeC [8] về nguồn web và rò rỉ thời gian; ViFactCheck [9], ViWikiFC [10], ViNumFCR [11] về kiểm chứng tiếng Việt và số liệu. Các bài này dùng làm bối cảnh, không tái tạo hệ thống.</w:t>
       </w:r>
     </w:p>
     <w:p>
@@ -5032,8 +5038,9 @@
           <w:sz w:val="26"/>
           <w:szCs w:val="26"/>
           <w:rtl w:val="0"/>
+          <w:color w:val="C00000"/>
         </w:rPr>
-        <w:t xml:space="preserve">Bộ minh họa hiện có 23 ví dụ: EX-01–20 kế thừa bản thảo, đã kiểm lại năm trang Apple và lưu HTML, văn bản, ảnh chụp, mã băm ngày 08/10/2026; ngày 07/10 ghi trong bản cũ chưa có snapshot để xác nhận. EX-21–23 là ba ca xung đột GIẢ LẬP do Codex soạn trong lần rà soát này, không gán thông số cho Apple. Nguồn gốc 20 câu cũ CHƯA XÁC ĐỊNH: thiếu log không chứng minh là không do LLM sinh. Giữ câu cũ riêng và đánh dấu câu biên tập có kiểm soát; nhãn chỉ áp dụng cho câu đã rà soát. Các ví dụ không phải minh chứng hoàn thành tháng 9; chưa được tính vào dữ liệu LLM chuẩn/pilot/test. Hồ sơ từng mẫu: evidence/2026-10-08/examples.json; ảnh và nguồn: evidence/2026-10-08/README.md. Phải có model/phiên bản, prompt, cấu hình sinh, thời điểm và đầu ra gốc trước khi xác nhận quảng cáo LLM; biến thể cần mẫu cha và thao tác sửa.</w:t>
+        <w:t xml:space="preserve">Bộ minh họa có 23 ví dụ (sau kỳ, không phải minh chứng hoàn thành tháng 9): EX-01–20 kế thừa bản thảo, nguồn Apple được kiểm lại và lưu ảnh, văn bản, mã băm ngày 08/10/2026; EX-21–23 là ca xung đột giả lập do AI soạn. Mỗi bảng tách câu gốc và câu rà soát. Nhãn ghi trong bảng áp cho câu rà soát; câu gốc giữ cùng nhãn nếu GVHD chấp nhận luật inherit_headline (dự thảo), trừ EX-13–15 phụ thuộc quyết định về nguồn thị trường Moldova. Nguồn gốc sinh của 20 câu cũ chưa xác định nên chưa dùng làm dữ liệu LLM.</w:t>
       </w:r>
     </w:p>
     <w:p>
@@ -8891,6 +8898,26 @@
               <w:t xml:space="preserve">Refuted</w:t>
             </w:r>
           </w:p>
+          <w:p>
+            <w:pPr>
+              <w:ind w:left="60" w:firstLine="0"/>
+              <w:rPr>
+                <w:rFonts w:ascii="Times New Roman" w:cs="Times New Roman" w:eastAsia="Times New Roman" w:hAnsi="Times New Roman"/>
+                <w:sz w:val="24"/>
+                <w:szCs w:val="24"/>
+              </w:rPr>
+            </w:pPr>
+            <w:r>
+              <w:rPr>
+                <w:rFonts w:ascii="Times New Roman" w:cs="Times New Roman" w:eastAsia="Times New Roman" w:hAnsi="Times New Roman"/>
+                <w:sz w:val="24"/>
+                <w:szCs w:val="24"/>
+                <w:rtl w:val="0"/>
+                <w:color w:val="C00000"/>
+              </w:rPr>
+              <w:t xml:space="preserve">Câu gốc: cùng nhãn nếu áp luật inherit_headline (dự thảo); đọc nghĩa đen điều kiện thử thì câu gốc là NEI-thiếu.</w:t>
+            </w:r>
+          </w:p>
         </w:tc>
       </w:tr>
       <w:tr>
@@ -10750,6 +10777,26 @@
                 <w:rtl w:val="0"/>
               </w:rPr>
               <w:t xml:space="preserve">Supported</w:t>
+            </w:r>
+          </w:p>
+          <w:p>
+            <w:pPr>
+              <w:ind w:left="60" w:firstLine="0"/>
+              <w:rPr>
+                <w:rFonts w:ascii="Times New Roman" w:cs="Times New Roman" w:eastAsia="Times New Roman" w:hAnsi="Times New Roman"/>
+                <w:sz w:val="24"/>
+                <w:szCs w:val="24"/>
+              </w:rPr>
+            </w:pPr>
+            <w:r>
+              <w:rPr>
+                <w:rFonts w:ascii="Times New Roman" w:cs="Times New Roman" w:eastAsia="Times New Roman" w:hAnsi="Times New Roman"/>
+                <w:sz w:val="24"/>
+                <w:szCs w:val="24"/>
+                <w:rtl w:val="0"/>
+                <w:color w:val="C00000"/>
+              </w:rPr>
+              <w:t xml:space="preserve">Câu gốc: cùng nhãn nếu áp luật inherit_headline (dự thảo); đọc nghĩa đen điều kiện thử thì câu gốc là NEI-thiếu.</w:t>
             </w:r>
           </w:p>
         </w:tc>
@@ -13564,6 +13611,30 @@
               <w:t xml:space="preserve">Supported</w:t>
             </w:r>
           </w:p>
+          <w:p>
+            <w:pPr>
+              <w:ind w:left="60" w:firstLine="0"/>
+              <w:rPr>
+                <w:rFonts w:ascii="Times New Roman" w:cs="Times New Roman" w:eastAsia="Times New Roman" w:hAnsi="Times New Roman"/>
+                <w:b w:val="1"/>
+                <w:bCs w:val="1"/>
+                <w:sz w:val="24"/>
+                <w:szCs w:val="24"/>
+              </w:rPr>
+            </w:pPr>
+            <w:r>
+              <w:rPr>
+                <w:rFonts w:ascii="Times New Roman" w:cs="Times New Roman" w:eastAsia="Times New Roman" w:hAnsi="Times New Roman"/>
+                <w:b w:val="1"/>
+                <w:bCs w:val="1"/>
+                <w:sz w:val="24"/>
+                <w:szCs w:val="24"/>
+                <w:rtl w:val="0"/>
+                <w:color w:val="C00000"/>
+              </w:rPr>
+              <w:t xml:space="preserve">Câu gốc: cùng nhãn nếu áp luật inherit_headline (dự thảo); đọc nghĩa đen điều kiện thử thì câu gốc là NEI-thiếu.</w:t>
+            </w:r>
+          </w:p>
         </w:tc>
       </w:tr>
       <w:tr>
@@ -15438,6 +15509,30 @@
               <w:t xml:space="preserve">Refuted</w:t>
             </w:r>
           </w:p>
+          <w:p>
+            <w:pPr>
+              <w:ind w:left="60" w:firstLine="0"/>
+              <w:rPr>
+                <w:rFonts w:ascii="Times New Roman" w:cs="Times New Roman" w:eastAsia="Times New Roman" w:hAnsi="Times New Roman"/>
+                <w:b w:val="1"/>
+                <w:bCs w:val="1"/>
+                <w:sz w:val="24"/>
+                <w:szCs w:val="24"/>
+              </w:rPr>
+            </w:pPr>
+            <w:r>
+              <w:rPr>
+                <w:rFonts w:ascii="Times New Roman" w:cs="Times New Roman" w:eastAsia="Times New Roman" w:hAnsi="Times New Roman"/>
+                <w:b w:val="1"/>
+                <w:bCs w:val="1"/>
+                <w:sz w:val="24"/>
+                <w:szCs w:val="24"/>
+                <w:rtl w:val="0"/>
+                <w:color w:val="C00000"/>
+              </w:rPr>
+              <w:t xml:space="preserve">Câu gốc: cùng nhãn nếu áp luật inherit_headline (dự thảo); đọc nghĩa đen điều kiện thử thì câu gốc là NEI-thiếu.</w:t>
+            </w:r>
+          </w:p>
         </w:tc>
       </w:tr>
       <w:tr>
@@ -16373,6 +16468,30 @@
                 <w:rtl w:val="0"/>
               </w:rPr>
               <w:t xml:space="preserve">Supported</w:t>
+            </w:r>
+          </w:p>
+          <w:p>
+            <w:pPr>
+              <w:ind w:left="60" w:firstLine="0"/>
+              <w:rPr>
+                <w:rFonts w:ascii="Times New Roman" w:cs="Times New Roman" w:eastAsia="Times New Roman" w:hAnsi="Times New Roman"/>
+                <w:b w:val="1"/>
+                <w:bCs w:val="1"/>
+                <w:sz w:val="24"/>
+                <w:szCs w:val="24"/>
+              </w:rPr>
+            </w:pPr>
+            <w:r>
+              <w:rPr>
+                <w:rFonts w:ascii="Times New Roman" w:cs="Times New Roman" w:eastAsia="Times New Roman" w:hAnsi="Times New Roman"/>
+                <w:b w:val="1"/>
+                <w:bCs w:val="1"/>
+                <w:sz w:val="24"/>
+                <w:szCs w:val="24"/>
+                <w:rtl w:val="0"/>
+                <w:color w:val="C00000"/>
+              </w:rPr>
+              <w:t xml:space="preserve">Câu gốc: cùng nhãn nếu áp luật inherit_headline (dự thảo); đọc nghĩa đen điều kiện thử thì câu gốc là NEI-thiếu.</w:t>
             </w:r>
           </w:p>
         </w:tc>
@@ -17318,6 +17437,30 @@
               <w:t xml:space="preserve">Supported</w:t>
             </w:r>
           </w:p>
+          <w:p>
+            <w:pPr>
+              <w:ind w:left="60" w:firstLine="0"/>
+              <w:rPr>
+                <w:rFonts w:ascii="Times New Roman" w:cs="Times New Roman" w:eastAsia="Times New Roman" w:hAnsi="Times New Roman"/>
+                <w:b w:val="1"/>
+                <w:bCs w:val="1"/>
+                <w:sz w:val="24"/>
+                <w:szCs w:val="24"/>
+              </w:rPr>
+            </w:pPr>
+            <w:r>
+              <w:rPr>
+                <w:rFonts w:ascii="Times New Roman" w:cs="Times New Roman" w:eastAsia="Times New Roman" w:hAnsi="Times New Roman"/>
+                <w:b w:val="1"/>
+                <w:bCs w:val="1"/>
+                <w:sz w:val="24"/>
+                <w:szCs w:val="24"/>
+                <w:rtl w:val="0"/>
+                <w:color w:val="C00000"/>
+              </w:rPr>
+              <w:t xml:space="preserve">Câu gốc: nguồn là trang thị trường Moldova; nếu chỉ chấp nhận nguồn Việt Nam thì câu gốc là NEI-thiếu (chờ GVHD quyết định).</w:t>
+            </w:r>
+          </w:p>
         </w:tc>
       </w:tr>
       <w:tr>
@@ -18228,6 +18371,30 @@
               <w:t xml:space="preserve">Supported</w:t>
             </w:r>
           </w:p>
+          <w:p>
+            <w:pPr>
+              <w:ind w:left="60" w:firstLine="0"/>
+              <w:rPr>
+                <w:rFonts w:ascii="Times New Roman" w:cs="Times New Roman" w:eastAsia="Times New Roman" w:hAnsi="Times New Roman"/>
+                <w:b w:val="1"/>
+                <w:bCs w:val="1"/>
+                <w:sz w:val="24"/>
+                <w:szCs w:val="24"/>
+              </w:rPr>
+            </w:pPr>
+            <w:r>
+              <w:rPr>
+                <w:rFonts w:ascii="Times New Roman" w:cs="Times New Roman" w:eastAsia="Times New Roman" w:hAnsi="Times New Roman"/>
+                <w:b w:val="1"/>
+                <w:bCs w:val="1"/>
+                <w:sz w:val="24"/>
+                <w:szCs w:val="24"/>
+                <w:rtl w:val="0"/>
+                <w:color w:val="C00000"/>
+              </w:rPr>
+              <w:t xml:space="preserve">Câu gốc: nguồn là trang thị trường Moldova; nếu chỉ chấp nhận nguồn Việt Nam thì câu gốc là NEI-thiếu (chờ GVHD quyết định).</w:t>
+            </w:r>
+          </w:p>
         </w:tc>
       </w:tr>
       <w:tr>
@@ -19155,6 +19322,30 @@
                 <w:rtl w:val="0"/>
               </w:rPr>
               <w:t xml:space="preserve">Refuted</w:t>
+            </w:r>
+          </w:p>
+          <w:p>
+            <w:pPr>
+              <w:ind w:left="60" w:firstLine="0"/>
+              <w:rPr>
+                <w:rFonts w:ascii="Times New Roman" w:cs="Times New Roman" w:eastAsia="Times New Roman" w:hAnsi="Times New Roman"/>
+                <w:b w:val="1"/>
+                <w:bCs w:val="1"/>
+                <w:sz w:val="24"/>
+                <w:szCs w:val="24"/>
+              </w:rPr>
+            </w:pPr>
+            <w:r>
+              <w:rPr>
+                <w:rFonts w:ascii="Times New Roman" w:cs="Times New Roman" w:eastAsia="Times New Roman" w:hAnsi="Times New Roman"/>
+                <w:b w:val="1"/>
+                <w:bCs w:val="1"/>
+                <w:sz w:val="24"/>
+                <w:szCs w:val="24"/>
+                <w:rtl w:val="0"/>
+                <w:color w:val="C00000"/>
+              </w:rPr>
+              <w:t xml:space="preserve">Câu gốc: nguồn là trang thị trường Moldova; nếu chỉ chấp nhận nguồn Việt Nam thì câu gốc là NEI-thiếu (chờ GVHD quyết định).</w:t>
             </w:r>
           </w:p>
         </w:tc>
@@ -21056,6 +21247,30 @@
               <w:t xml:space="preserve">Supported</w:t>
             </w:r>
           </w:p>
+          <w:p>
+            <w:pPr>
+              <w:ind w:left="60" w:firstLine="0"/>
+              <w:rPr>
+                <w:rFonts w:ascii="Times New Roman" w:cs="Times New Roman" w:eastAsia="Times New Roman" w:hAnsi="Times New Roman"/>
+                <w:b w:val="1"/>
+                <w:bCs w:val="1"/>
+                <w:sz w:val="24"/>
+                <w:szCs w:val="24"/>
+              </w:rPr>
+            </w:pPr>
+            <w:r>
+              <w:rPr>
+                <w:rFonts w:ascii="Times New Roman" w:cs="Times New Roman" w:eastAsia="Times New Roman" w:hAnsi="Times New Roman"/>
+                <w:b w:val="1"/>
+                <w:bCs w:val="1"/>
+                <w:sz w:val="24"/>
+                <w:szCs w:val="24"/>
+                <w:rtl w:val="0"/>
+                <w:color w:val="C00000"/>
+              </w:rPr>
+              <w:t xml:space="preserve">Câu gốc: cùng nhãn nếu áp luật inherit_headline (dự thảo); đọc nghĩa đen điều kiện thử thì câu gốc là NEI-thiếu.</w:t>
+            </w:r>
+          </w:p>
         </w:tc>
       </w:tr>
       <w:tr>
@@ -21993,6 +22208,30 @@
               <w:t xml:space="preserve">Refuted</w:t>
             </w:r>
           </w:p>
+          <w:p>
+            <w:pPr>
+              <w:ind w:left="60" w:firstLine="0"/>
+              <w:rPr>
+                <w:rFonts w:ascii="Times New Roman" w:cs="Times New Roman" w:eastAsia="Times New Roman" w:hAnsi="Times New Roman"/>
+                <w:b w:val="1"/>
+                <w:bCs w:val="1"/>
+                <w:sz w:val="24"/>
+                <w:szCs w:val="24"/>
+              </w:rPr>
+            </w:pPr>
+            <w:r>
+              <w:rPr>
+                <w:rFonts w:ascii="Times New Roman" w:cs="Times New Roman" w:eastAsia="Times New Roman" w:hAnsi="Times New Roman"/>
+                <w:b w:val="1"/>
+                <w:bCs w:val="1"/>
+                <w:sz w:val="24"/>
+                <w:szCs w:val="24"/>
+                <w:rtl w:val="0"/>
+                <w:color w:val="C00000"/>
+              </w:rPr>
+              <w:t xml:space="preserve">Câu gốc: cùng nhãn nếu áp luật inherit_headline (dự thảo); đọc nghĩa đen điều kiện thử thì câu gốc là NEI-thiếu.</w:t>
+            </w:r>
+          </w:p>
         </w:tc>
       </w:tr>
       <w:tr>
@@ -22928,6 +23167,30 @@
                 <w:rtl w:val="0"/>
               </w:rPr>
               <w:t xml:space="preserve">Supported</w:t>
+            </w:r>
+          </w:p>
+          <w:p>
+            <w:pPr>
+              <w:ind w:left="60" w:firstLine="0"/>
+              <w:rPr>
+                <w:rFonts w:ascii="Times New Roman" w:cs="Times New Roman" w:eastAsia="Times New Roman" w:hAnsi="Times New Roman"/>
+                <w:b w:val="1"/>
+                <w:bCs w:val="1"/>
+                <w:sz w:val="24"/>
+                <w:szCs w:val="24"/>
+              </w:rPr>
+            </w:pPr>
+            <w:r>
+              <w:rPr>
+                <w:rFonts w:ascii="Times New Roman" w:cs="Times New Roman" w:eastAsia="Times New Roman" w:hAnsi="Times New Roman"/>
+                <w:b w:val="1"/>
+                <w:bCs w:val="1"/>
+                <w:sz w:val="24"/>
+                <w:szCs w:val="24"/>
+                <w:rtl w:val="0"/>
+                <w:color w:val="C00000"/>
+              </w:rPr>
+              <w:t xml:space="preserve">Câu gốc: cùng nhãn nếu áp luật inherit_headline (dự thảo); đọc nghĩa đen điều kiện thử thì câu gốc là NEI-thiếu.</w:t>
             </w:r>
           </w:p>
         </w:tc>
@@ -26748,8 +27011,9 @@
           <w:sz w:val="26"/>
           <w:szCs w:val="26"/>
           <w:rtl w:val="0"/>
+          <w:color w:val="C00000"/>
         </w:rPr>
-        <w:t xml:space="preserve">Cần xác nhận tài nguyên thực tế bằng hồ sơ: CPU [chưa có]; RAM [chưa có]; GPU/VRAM hoặc điều kiện API và ngân sách [chưa có]; hệ điều hành và môi trường chạy [chưa có]. Không suy ra cấu hình thí nghiệm tháng 9 từ máy đang dùng để sửa tài liệu.</w:t>
+        <w:t xml:space="preserve">Đến 30/09/2026 chưa có cấu hình máy, mã thử hay log chạy LLM được lưu; mục này chưa hoàn thành trong kỳ.</w:t>
       </w:r>
     </w:p>
     <w:p>
@@ -26764,8 +27028,9 @@
           <w:sz w:val="26"/>
           <w:szCs w:val="26"/>
           <w:rtl w:val="0"/>
+          <w:color w:val="C00000"/>
         </w:rPr>
-        <w:t xml:space="preserve">Cần ghi tối đa hai mô hình ứng viên với tên/phiên bản, nơi chạy, cấu hình sinh và lý do phù hợp ngân sách; mã thử/commit, đường dẫn log, đầu vào, JSON gốc, lỗi, thời gian và tài nguyên. Hồ sơ hiện chưa có các thông tin này để xác nhận mô hình đã được chọn hoặc thử thành công.</w:t>
+        <w:t xml:space="preserve">Sau kỳ, hướng chạy đã chọn là Llama qua API: nhà cung cấp [SINH VIÊN ĐIỀN], mã mô hình [SINH VIÊN ĐIỀN], ngân sách tối đa [SINH VIÊN ĐIỀN]; máy cá nhân [SINH VIÊN ĐIỀN: CPU/RAM/hệ điều hành] chỉ chạy BM25 và Python. Mỗi lần gọi lưu run_manifest (nhà cung cấp, mô hình trả về, tham số, thời điểm), không lưu khóa API.</w:t>
       </w:r>
     </w:p>
     <w:p>
@@ -26784,10 +27049,10 @@
           <w:rFonts w:ascii="Times New Roman" w:cs="Times New Roman" w:eastAsia="Times New Roman" w:hAnsi="Times New Roman"/>
           <w:i w:val="1"/>
           <w:iCs w:val="1"/>
-          <w:color w:val="7a5c00"/>
           <w:rtl w:val="0"/>
+          <w:color w:val="C00000"/>
         </w:rPr>
-        <w:t xml:space="preserve">Trạng thái minh chứng tài nguyên và LLM: chưa được xác nhận. Nếu có log được tạo đến 30/09/2026, ghi đường dẫn và thời điểm thực tế; nếu thử từ 01/10 trở đi, đưa vào Gate 1–2 tháng 10 và không tính thành kết quả tháng 9.</w:t>
+        <w:t xml:space="preserve">Việc thử trích xuất trên 5 ví dụ và lô 0 sinh quảng cáo nằm trong Gate 1 tháng 10 (xem mục 5).</w:t>
       </w:r>
     </w:p>
     <w:p>
@@ -26838,12 +27103,12 @@
           <w:bCs w:val="1"/>
           <w:i w:val="1"/>
           <w:iCs w:val="1"/>
-          <w:color w:val="1f3864"/>
           <w:sz w:val="26"/>
           <w:szCs w:val="26"/>
           <w:rtl w:val="0"/>
+          <w:color w:val="C00000"/>
         </w:rPr>
-        <w:t xml:space="preserve">Bảng đối chiếu dùng ba trạng thái nêu tại mục 1. Chưa có hồ sơ đủ định thời để xếp đầu việc vào “đã có minh chứng trong kỳ”; điều này không đồng nghĩa khẳng định sinh viên chưa làm. Những phần có trong bản thảo và cập nhật sau kỳ được ghi riêng.</w:t>
+        <w:t xml:space="preserve">Trạng thái dùng ba mức: hoàn thành trong kỳ (có minh chứng đến 30/09), có trong bản thảo nhưng chưa xác nhận ngày, và thực hiện sau kỳ.</w:t>
       </w:r>
     </w:p>
     <w:tbl>
@@ -27027,8 +27292,9 @@
               <w:rPr>
                 <w:rFonts w:ascii="Times New Roman" w:cs="Times New Roman" w:eastAsia="Times New Roman" w:hAnsi="Times New Roman"/>
                 <w:rtl w:val="0"/>
-              </w:rPr>
-              <w:t xml:space="preserve">Có trong bản thảo, chưa xác nhận thời điểm: đã có phần tổng hợp sáu bài; cần bản lưu hoặc nhật ký đến 30/09/2026 để xác nhận hoàn thành trong kỳ.</w:t>
+                <w:color w:val="C00000"/>
+              </w:rPr>
+              <w:t xml:space="preserve">Có trong bản thảo, chưa xác nhận ngày: tổng hợp sáu bài [1]–[6]. Số liệu từng bài đã đối chiếu lại sau kỳ; sinh viên tự kiểm PDF gốc [SINH VIÊN ĐIỀN: ngày].</w:t>
             </w:r>
           </w:p>
         </w:tc>
@@ -27102,8 +27368,9 @@
               <w:rPr>
                 <w:rFonts w:ascii="Times New Roman" w:cs="Times New Roman" w:eastAsia="Times New Roman" w:hAnsi="Times New Roman"/>
                 <w:rtl w:val="0"/>
-              </w:rPr>
-              <w:t xml:space="preserve">Có trong bản thảo, chưa xác nhận thời điểm: tiêu chí nguồn, hồ sơ dữ liệu và ba nhãn đã được mô tả; schema/hướng dẫn có phiên bản được chốt tại Gate 1 tháng 10.</w:t>
+                <w:color w:val="C00000"/>
+              </w:rPr>
+              <w:t xml:space="preserve">Có trong bản thảo, chưa xác nhận ngày: tiêu chí nguồn, cấu trúc dữ liệu, ba nhãn. Hướng dẫn nhãn có phiên bản được khóa ở Gate 1.</w:t>
             </w:r>
           </w:p>
         </w:tc>
@@ -27177,8 +27444,9 @@
               <w:rPr>
                 <w:rFonts w:ascii="Times New Roman" w:cs="Times New Roman" w:eastAsia="Times New Roman" w:hAnsi="Times New Roman"/>
                 <w:rtl w:val="0"/>
-              </w:rPr>
-              <w:t xml:space="preserve">Cập nhật sau kỳ: EX-01–20 đã kiểm nguồn/ảnh ngày 08/10, nguồn gốc câu cũ chưa xác định; EX-21–23 giả lập xung đột. Chưa tính 23 ví dụ này là dữ liệu LLM chuẩn hoặc minh chứng tháng 9.</w:t>
+                <w:color w:val="C00000"/>
+              </w:rPr>
+              <w:t xml:space="preserve">Sau kỳ: 23 ví dụ (20 kiểm nguồn ngày 08/10, 3 giả lập). Chưa tính là dữ liệu LLM.</w:t>
             </w:r>
           </w:p>
         </w:tc>
@@ -27252,8 +27520,9 @@
               <w:rPr>
                 <w:rFonts w:ascii="Times New Roman" w:cs="Times New Roman" w:eastAsia="Times New Roman" w:hAnsi="Times New Roman"/>
                 <w:rtl w:val="0"/>
-              </w:rPr>
-              <w:t xml:space="preserve">Chuyển sang thực hiện/xác nhận tháng 10: hồ sơ chưa có cấu hình, mã thử, log hoặc số đo. Nếu tìm được log đúng kỳ thì cập nhật trạng thái theo ngày thực tế.</w:t>
+                <w:color w:val="C00000"/>
+              </w:rPr>
+              <w:t xml:space="preserve">Chưa hoàn thành trong kỳ: chưa có log LLM. Chuyển sang Gate 1 tháng 10.</w:t>
             </w:r>
           </w:p>
         </w:tc>
@@ -27282,13 +27551,9 @@
           <w:sz w:val="26"/>
           <w:szCs w:val="26"/>
           <w:rtl w:val="0"/>
+          <w:color w:val="C00000"/>
         </w:rPr>
-        <w:t xml:space="preserve">Các vấn đề cần giải quyết trước khi mở rộng dữ liệu là phân biệt thiếu bằng chứng với bác bỏ, xử lý điều kiện áp dụng, xác định cách lưu nguồn và chọn mô hình phù hợp tài nguyên. Sau khi có pilot, cần kiểm tra xem thiết kế này có đáp ứng các tình huống thực tế hay phải điều chỉnh.</w:t>
-      </w:r>
-      <w:r>
-        <w:rPr>
-          <w:rtl w:val="0"/>
-        </w:rPr>
+        <w:t xml:space="preserve">Vấn đề phương pháp phát hiện khi soạn ví dụ: (1) câu quảng cáo thường không nêu điều kiện thử, nếu đọc nghĩa đen thì 11/23 câu gốc chuyển sang NEI — đề xuất luật inherit_headline; (2) EX-13–15 dùng trang Apple thị trường Moldova; (3) tập test dự kiến nhỏ nên RQ3 chỉ thăm dò. Các điểm này đã đưa vào đề cương điều chỉnh, chờ GVHD xác nhận.</w:t>
       </w:r>
     </w:p>
     <w:p>
@@ -27307,10 +27572,10 @@
           <w:rFonts w:ascii="Times New Roman" w:cs="Times New Roman" w:eastAsia="Times New Roman" w:hAnsi="Times New Roman"/>
           <w:i w:val="1"/>
           <w:iCs w:val="1"/>
-          <w:color w:val="7a5c00"/>
           <w:rtl w:val="0"/>
+          <w:color w:val="C00000"/>
         </w:rPr>
-        <w:t xml:space="preserve">Khó khăn thực tế cần xác nhận: đầu việc bị vướng [chưa có ghi nhận]; thời điểm và nguyên nhân [chưa xác nhận]; ảnh hưởng tới tiến độ [chưa xác nhận]; biện pháp đã thử và nội dung cần giảng viên hỗ trợ [chưa xác nhận]. Các rủi ro dự kiến trong đề cương không được viết thành sự cố đã xảy ra tháng 9.</w:t>
+        <w:t xml:space="preserve">Khó khăn thực tế trong kỳ: [SINH VIÊN ĐIỀN: đầu việc bị vướng, nguyên nhân, ảnh hưởng, nội dung cần giảng viên hỗ trợ].</w:t>
       </w:r>
     </w:p>
     <w:p>
@@ -27361,12 +27626,12 @@
           <w:bCs w:val="1"/>
           <w:i w:val="1"/>
           <w:iCs w:val="1"/>
-          <w:color w:val="1f3864"/>
           <w:sz w:val="26"/>
           <w:szCs w:val="26"/>
           <w:rtl w:val="0"/>
+          <w:color w:val="C00000"/>
         </w:rPr>
-        <w:t xml:space="preserve">Tháng 10 tổ chức theo Gate 1–2 của đề cương cập nhật. Mục tiêu là hoàn thiện hồ sơ, pilot và chương trình tối thiểu; các số lượng dưới đây là kế hoạch, không phải kết quả đã đạt.</w:t>
+        <w:t xml:space="preserve">Tháng 10 theo Gate 1 của đề cương điều chỉnh (chờ GVHD xác nhận). Các số dưới đây là kế hoạch, chưa phải kết quả.</w:t>
       </w:r>
     </w:p>
     <w:p>
@@ -27385,8 +27650,9 @@
           <w:sz w:val="26"/>
           <w:szCs w:val="26"/>
           <w:rtl w:val="0"/>
+          <w:color w:val="C00000"/>
         </w:rPr>
-        <w:t xml:space="preserve">Gate 1 (01–15/10): rà soát minh chứng tháng 9; khóa schema, hướng dẫn nhãn và lưu nguồn. EX-01–20 đã có snapshot kiểm lại 08/10 nhưng nguồn gốc câu gốc vẫn chưa xác định; EX-21–23 là ca xung đột giả lập. Không dùng các mẫu này để xác nhận đã thu quảng cáo LLM.</w:t>
+        <w:t xml:space="preserve">Gate 1 (08–31/10): thu hồi khóa API cũ; chọn nhà cung cấp và mô hình Llama; thử trích xuất JSON trên 5 ví dụ; chạy lô 0 gồm 2 họ × 5 quảng cáo ordinary_llm, lưu quảng cáo thô, prompt và log; tách, gán nhãn và bấm giờ; khóa hướng dẫn nhãn v1; mời người gán độc lập 30 phát biểu trước 20/10; ghi search_log cho NEI.</w:t>
       </w:r>
     </w:p>
     <w:p>
@@ -27405,8 +27671,9 @@
           <w:sz w:val="26"/>
           <w:szCs w:val="26"/>
           <w:rtl w:val="0"/>
+          <w:color w:val="C00000"/>
         </w:rPr>
-        <w:t xml:space="preserve">Đầu ra Gate 1: pilot 45–60 claim thuộc đúng 6 họ có provenance LLM, nguồn và nhãn; hồ sơ máy/API, log thử tối đa hai mô hình. Sáu họ ở dev trong mọi tầng quy mô. Nếu chưa đủ 45 claim / 6 họ hợp lệ đến 15/10, ưu tiên mức tối thiểu và dừng phần mở rộng.</w:t>
+        <w:t xml:space="preserve">Đầu ra 31/10: log lô 0, số phát biểu/quảng cáo, phút gán nhãn/phát biểu, chi phí mỗi lần gọi, biên bản chốt quyết định với GVHD (luật điều kiện thử, nguồn Moldova, hãng ngoài Apple, quy mô).</w:t>
       </w:r>
     </w:p>
     <w:p>
@@ -27425,8 +27692,9 @@
           <w:sz w:val="26"/>
           <w:szCs w:val="26"/>
           <w:rtl w:val="0"/>
+          <w:color w:val="C00000"/>
         </w:rPr>
-        <w:t xml:space="preserve">Gate 2 (16–31/10): hoàn thiện BM25, thử k = 3, 5, 8 trên dev/pilot theo tiêu chí ghi trước; đo recall theo họ, kiểm tra JSON, chạy B0/P tối thiểu và lưu log/chi phí. Khóa mô hình, prompt và k trên dev trước 30/11; dung sai dựa nguồn, không tối ưu theo nhãn. Val chỉ audit/smoke test một lượt sau khóa, không tìm kiếm cấu hình trên hai họ val.</w:t>
+        <w:t xml:space="preserve">Gate 2 (01–14/11): pilot đúng 6 họ dev (45–60 phát biểu); BM25 lọc sản phẩm với k = 3, 5, 8, báo recall@k kèm N và k_eff; chạy B0 và P tối thiểu; quyết định quy mô.</w:t>
       </w:r>
     </w:p>
     <w:p>
@@ -27445,8 +27713,9 @@
           <w:sz w:val="26"/>
           <w:szCs w:val="26"/>
           <w:rtl w:val="0"/>
+          <w:color w:val="C00000"/>
         </w:rPr>
-        <w:t xml:space="preserve">Quy mô: tối thiểu 120 claim / 12 họ, dev/val/test = 6/2/4; mục tiêu 180 / 18–20 họ tương ứng 7/4/7 hoặc 8/4/8; mở rộng 300/30 nếu đủ lực. Pilot cố định sáu họ trong dev. RQ3 ở mức tối thiểu là thăm dò: báo ΔFAR, ΔRecall, kết quả từng họ và bất định; không dùng toàn bộ khoảng FAR dưới 0 làm cửa đạt/rớt. ΔFAR&lt;0, ΔRecall≥−5 điểm chỉ là xu hướng quan sát, không xác nhận ưu thế tổng quát.</w:t>
+        <w:t xml:space="preserve">Quy mô cam kết 120 phát biểu / 12 họ (6/2/4), nhóm sinh thông thường ≥ 50%; 180/18 (7/4/7) chỉ khi năng suất đo được cho phép. RQ3 ở mức thăm dò; thực nghiệm chính chạy 3 lượt trên 30 phát biểu để xem dao động.</w:t>
       </w:r>
     </w:p>
     <w:p>
@@ -27465,8 +27734,9 @@
           <w:sz w:val="26"/>
           <w:szCs w:val="26"/>
           <w:rtl w:val="0"/>
+          <w:color w:val="C00000"/>
         </w:rPr>
-        <w:t xml:space="preserve">MVP cuối khóa luận gồm dữ liệu có provenance, nhãn, BM25, JSON, B0/B1/P và đánh giá E3; B1 hoàn thiện ở Gate 3 (01–20/11), khóa giao thức ở Gate 4 (21–30/11). P−A/P−B, E1/E2, tách tự động và website là tùy chọn sau MVP. Kết quả so sánh được chạy ở Gate 5 (01–15/12), viết và bàn giao ở Gate 6 (16–31/12).</w:t>
+        <w:t xml:space="preserve">Các mốc sau: Gate 3 (15/11–04/12) dữ liệu và B1; Gate 4 (05–11/12) khóa giao thức; Gate 5 (12–21/12) thực nghiệm; Gate 6 (22–31/12) viết và bàn giao. Đánh giá trên phát biểu đã tách thủ công, không trên quảng cáo thô.</w:t>
       </w:r>
     </w:p>
     <w:p>
@@ -27481,8 +27751,9 @@
           <w:sz w:val="26"/>
           <w:szCs w:val="26"/>
           <w:rtl w:val="0"/>
+          <w:color w:val="C00000"/>
         </w:rPr>
-        <w:t xml:space="preserve">Báo cáo tháng 9 chỉ xác nhận sản phẩm có minh chứng đến 30/09/2026. Bộ EX-01–EX-20 và phần đọc thêm bổ sung trong bản rà soát tháng 10 không được dùng làm bằng chứng hoàn thành tháng 9. Chưa có kết quả chứng minh P tốt hơn B0/B1.</w:t>
+        <w:t xml:space="preserve">Chưa có kết quả so sánh P với B0/B1.</w:t>
       </w:r>
     </w:p>
     <w:p>
@@ -27744,17 +28015,12 @@
           <w:rFonts w:ascii="Times New Roman" w:cs="Times New Roman" w:eastAsia="Times New Roman" w:hAnsi="Times New Roman"/>
           <w:b w:val="1"/>
           <w:bCs w:val="1"/>
-          <w:color w:val="1f3864"/>
           <w:sz w:val="28"/>
           <w:szCs w:val="28"/>
           <w:rtl w:val="0"/>
+          <w:color w:val="C00000"/>
         </w:rPr>
-        <w:t xml:space="preserve">Hồ sơ sử dụng để lập báo cáo</w:t>
-      </w:r>
-      <w:r>
-        <w:rPr>
-          <w:rtl w:val="0"/>
-        </w:rPr>
+        <w:t xml:space="preserve">KHAI BÁO SỬ DỤNG CÔNG CỤ AI</w:t>
       </w:r>
     </w:p>
     <w:p>
@@ -27769,140 +28035,9 @@
           <w:sz w:val="26"/>
           <w:szCs w:val="26"/>
           <w:rtl w:val="0"/>
+          <w:color w:val="C00000"/>
         </w:rPr>
-        <w:t xml:space="preserve">Đề cương: “Đọc_báo_cùng_HuP_4_.docx”, bản rà soát 08/10/2026; không phải minh chứng nội dung đã hoàn thành tháng 9.</w:t>
-      </w:r>
-    </w:p>
-    <w:p>
-      <w:pPr>
-        <w:spacing w:after="120" w:line="360" w:lineRule="auto"/>
-        <w:jc w:val="both"/>
-        <w:rPr/>
-      </w:pPr>
-      <w:r>
-        <w:rPr>
-          <w:rFonts w:ascii="Times New Roman" w:cs="Times New Roman" w:eastAsia="Times New Roman" w:hAnsi="Times New Roman"/>
-          <w:sz w:val="26"/>
-          <w:szCs w:val="26"/>
-          <w:rtl w:val="0"/>
-        </w:rPr>
-        <w:t xml:space="preserve">Báo cáo: “Đọc_báo_cùng_HuP_3_.docx”; bài gốc trong báo/. Hồ sơ chưa có bản lưu 30/09 hoặc log thí nghiệm.</w:t>
-      </w:r>
-    </w:p>
-    <w:p>
-      <w:pPr>
-        <w:pStyle w:val="Heading2"/>
-        <w:keepLines w:val="0"/>
-        <w:spacing w:after="140" w:before="320" w:line="360" w:lineRule="auto"/>
-        <w:jc w:val="both"/>
-        <w:rPr/>
-      </w:pPr>
-      <w:r>
-        <w:rPr>
-          <w:rFonts w:ascii="Times New Roman" w:cs="Times New Roman" w:eastAsia="Times New Roman" w:hAnsi="Times New Roman"/>
-          <w:b w:val="1"/>
-          <w:bCs w:val="1"/>
-          <w:color w:val="1f3864"/>
-          <w:sz w:val="28"/>
-          <w:szCs w:val="28"/>
-          <w:rtl w:val="0"/>
-        </w:rPr>
-        <w:t xml:space="preserve">Các thông tin cần chốt trước khi nộp</w:t>
-      </w:r>
-      <w:r>
-        <w:rPr>
-          <w:rtl w:val="0"/>
-        </w:rPr>
-      </w:r>
-    </w:p>
-    <w:p>
-      <w:pPr>
-        <w:numPr>
-          <w:ilvl w:val="0"/>
-          <w:numId w:val="1"/>
-        </w:numPr>
-        <w:spacing w:before="140" w:line="340" w:lineRule="auto"/>
-        <w:ind w:left="709" w:hanging="360"/>
-        <w:jc w:val="both"/>
-      </w:pPr>
-      <w:r>
-        <w:rPr>
-          <w:rFonts w:ascii="Times New Roman" w:cs="Times New Roman" w:eastAsia="Times New Roman" w:hAnsi="Times New Roman"/>
-          <w:sz w:val="26"/>
-          <w:szCs w:val="26"/>
-          <w:rtl w:val="0"/>
-        </w:rPr>
-        <w:t xml:space="preserve">Xác nhận các phần thực sự hoàn thành từ 15/09 đến 30/09/2026.</w:t>
-      </w:r>
-      <w:r>
-        <w:rPr>
-          <w:rtl w:val="0"/>
-        </w:rPr>
-      </w:r>
-    </w:p>
-    <w:p>
-      <w:pPr>
-        <w:numPr>
-          <w:ilvl w:val="0"/>
-          <w:numId w:val="1"/>
-        </w:numPr>
-        <w:spacing w:before="140" w:line="340" w:lineRule="auto"/>
-        <w:ind w:left="709" w:hanging="360"/>
-        <w:jc w:val="both"/>
-      </w:pPr>
-      <w:r>
-        <w:rPr>
-          <w:rFonts w:ascii="Times New Roman" w:cs="Times New Roman" w:eastAsia="Times New Roman" w:hAnsi="Times New Roman"/>
-          <w:sz w:val="26"/>
-          <w:szCs w:val="26"/>
-          <w:rtl w:val="0"/>
-        </w:rPr>
-        <w:t xml:space="preserve">Đã đối chiếu nguồn 20 ví dụ ngày 08/10 và thêm ba ca xung đột giả lập; còn phải xác nhận lịch sử tạo 20 mẫu gốc trước khi dùng cho dữ liệu LLM.</w:t>
-      </w:r>
-    </w:p>
-    <w:p>
-      <w:pPr>
-        <w:numPr>
-          <w:ilvl w:val="0"/>
-          <w:numId w:val="1"/>
-        </w:numPr>
-        <w:spacing w:before="140" w:line="340" w:lineRule="auto"/>
-        <w:ind w:left="709" w:hanging="360"/>
-        <w:jc w:val="both"/>
-      </w:pPr>
-      <w:r>
-        <w:rPr>
-          <w:rFonts w:ascii="Times New Roman" w:cs="Times New Roman" w:eastAsia="Times New Roman" w:hAnsi="Times New Roman"/>
-          <w:sz w:val="26"/>
-          <w:szCs w:val="26"/>
-          <w:rtl w:val="0"/>
-        </w:rPr>
-        <w:t xml:space="preserve">Điền tài nguyên, mô hình và khó khăn còn chưa xác nhận; dẫn file/log đúng kỳ.</w:t>
-      </w:r>
-    </w:p>
-    <w:p>
-      <w:pPr>
-        <w:numPr>
-          <w:ilvl w:val="0"/>
-          <w:numId w:val="1"/>
-        </w:numPr>
-        <w:spacing w:before="140" w:line="340" w:lineRule="auto"/>
-        <w:ind w:left="709" w:hanging="360"/>
-        <w:jc w:val="both"/>
-      </w:pPr>
-      <w:r>
-        <w:rPr>
-          <w:rFonts w:ascii="Times New Roman" w:cs="Times New Roman" w:eastAsia="Times New Roman" w:hAnsi="Times New Roman"/>
-          <w:sz w:val="26"/>
-          <w:szCs w:val="26"/>
-          <w:rtl w:val="0"/>
-        </w:rPr>
-        <w:t xml:space="preserve">Chuyển nội dung hoàn thành sau 30/09 sang cập nhật tháng 10; bỏ ghi chú biên tập sau khi đã xác nhận.</w:t>
-      </w:r>
-      <w:r>
-        <w:rPr>
-          <w:rtl w:val="0"/>
-        </w:rPr>
+        <w:t xml:space="preserve">Phần tổng hợp/đối chiếu và biên tập trong bản cập nhật tháng 10 có công cụ AI hỗ trợ; các ca xung đột EX-21–23 do AI soạn để minh họa. Các nguồn gốc được dẫn riêng. Sinh viên cần tự kiểm tra nguồn và chịu trách nhiệm nội dung; tình trạng xác nhận thủ công: [SINH VIÊN ĐIỀN: phần đã tự kiểm, ngày].</w:t>
       </w:r>
     </w:p>
     <w:p>

</xml_diff>